<commit_message>
Add Part 2 Ethical Considerations and Teamwork sections
- Ethical Considerations: group-specific threshold results, sex-specific
  troponin precedent (Thygesen 2018, Shah 2015, Lee 2019), and deployment
  safeguards
- Figure 2 (threshold stability) with APA caption
- Teamwork and Documentation section
- References: Chen, Lee, Mosca, Rajkomar, Shah, Thygesen
- Decision log entry for 2026-10-09
</commit_message>
<xml_diff>
--- a/part2/report/drafts/Group8_Part2_Report_Draft.docx
+++ b/part2/report/drafts/Group8_Part2_Report_Draft.docx
@@ -132,12 +132,123 @@
     </w:p>
     <w:p>
       <w:r>
-        <w:t>The default-threshold recall was .714 for sex = 0 and .821 for sex = 1. Only seven test patients with disease belonged to sex = 0, making that estimate sensitive to individual cases. Lowering that subgroup threshold to .30 increased recall to .857 and added one false alarm. Across 30 overlapping splits, retrospectively selected equalizing thresholds averaged .336 (SD = .157) and ranged from .05 to .50. These analyses reveal instability; they do not validate a fairness intervention on independent patients.</w:t>
+        <w:t>At the default .50 threshold, the model detected disease less reliably for the sex = 0 subgroup, which coding and prevalence indicate is female (recall .714 vs. .821). We tested the obvious remedy, a lower decision threshold for that subgroup. On the test split, lowering the sex = 0 threshold to .30 raised recall to .857 at the cost of one additional false alarm. Across 30 resampled splits, however, the threshold needed to equalize recall averaged .336 (</w:t>
+      </w:r>
+      <w:r>
+        <w:rPr>
+          <w:i/>
+        </w:rPr>
+        <w:t>SD</w:t>
+      </w:r>
+      <w:r>
+        <w:t xml:space="preserve"> = .157) and ranged from .05 to .50 (Figure 2). Each split left a mean of 5.7 disease cases in the subgroup, so one patient moved subgroup recall by about 18 percentage points. Reporting the single split alone would have claimed a closed fairness gap on the strength of one patient.</w:t>
       </w:r>
     </w:p>
     <w:p>
       <w:r>
-        <w:t>Fairness monitoring should report subgroup sensitivity, false-positive rates, sample sizes, and uncertainty. Removing sex from predictors would not establish fairness, because other variables can retain related information. Sensitive attributes may be retained under appropriate governance for auditing. Additional obligations include verifying outcome coding, restricting access to patient data, documenting intended use, and providing human review and a route to challenge errors. An observed subgroup gap warrants investigation, without attributing its cause to historical discrimination from this dataset alone.</w:t>
+        <w:t>The remedy itself is established practice in cardiology. The fourth universal definition of myocardial infarction recommends sex-specific troponin limits (Thygesen et al., 2018). On one widely used assay these are 16 ng/L for women and 34 ng/L for men, and adopting them doubled myocardial infarction diagnoses in women, from 11% to 22%, with little change in men (Shah et al., 2015). When those thresholds were implemented across 10 hospitals, five times as many additional women as men were identified, yet women still received roughly half the treatment and outcomes did not improve (Lee et al., 2019). Two lessons transfer to our tool. A group-specific threshold needs far more outcome data than we hold, and a threshold changes only who is flagged, not what happens next.</w:t>
+      </w:r>
+    </w:p>
+    <w:p>
+      <w:r>
+        <w:t>We therefore apply no fairness correction to the prototype. Sex is retained for auditing, since removing it would hide the disparity without closing it (Rajkomar et al., 2018). Any deployment should report subgroup recall, false-positive rates, case counts, and uncertainty. It should estimate any subgroup threshold on development data large enough to support it, and it should monitor whether flagged patients in each group actually receive follow-up (Chen et al., 2019). The cohort is 302 patients from a 1989 referral population who did not consent to training a deployed system. Its records may also encode the long-documented under-recognition of coronary disease in women (Mosca et al., 2011).</w:t>
+      </w:r>
+    </w:p>
+    <w:p>
+      <w:pPr>
+        <w:keepNext/>
+        <w:ind w:firstLine="0"/>
+      </w:pPr>
+      <w:r>
+        <w:rPr>
+          <w:b/>
+        </w:rPr>
+        <w:t>Figure 2</w:t>
+      </w:r>
+    </w:p>
+    <w:p>
+      <w:pPr>
+        <w:keepNext/>
+        <w:ind w:firstLine="0"/>
+      </w:pPr>
+      <w:r>
+        <w:rPr>
+          <w:i/>
+        </w:rPr>
+        <w:t>Threshold Required to Equalize Subgroup Recall Across 30 Resampled Splits</w:t>
+      </w:r>
+    </w:p>
+    <w:p>
+      <w:pPr>
+        <w:keepNext/>
+        <w:ind w:firstLine="0"/>
+        <w:jc w:val="center"/>
+      </w:pPr>
+      <w:r>
+        <w:drawing>
+          <wp:inline xmlns:a="http://schemas.openxmlformats.org/drawingml/2006/main" xmlns:pic="http://schemas.openxmlformats.org/drawingml/2006/picture">
+            <wp:extent cx="5943600" cy="2046006"/>
+            <wp:docPr id="1" name="Picture 1"/>
+            <wp:cNvGraphicFramePr>
+              <a:graphicFrameLocks noChangeAspect="1"/>
+            </wp:cNvGraphicFramePr>
+            <a:graphic>
+              <a:graphicData uri="http://schemas.openxmlformats.org/drawingml/2006/picture">
+                <pic:pic>
+                  <pic:nvPicPr>
+                    <pic:cNvPr id="0" name="fig2_threshold_stability.png"/>
+                    <pic:cNvPicPr/>
+                  </pic:nvPicPr>
+                  <pic:blipFill>
+                    <a:blip r:embed="rId9"/>
+                    <a:stretch>
+                      <a:fillRect/>
+                    </a:stretch>
+                  </pic:blipFill>
+                  <pic:spPr>
+                    <a:xfrm>
+                      <a:off x="0" y="0"/>
+                      <a:ext cx="5943600" cy="2046006"/>
+                    </a:xfrm>
+                    <a:prstGeom prst="rect"/>
+                  </pic:spPr>
+                </pic:pic>
+              </a:graphicData>
+            </a:graphic>
+          </wp:inline>
+        </w:drawing>
+      </w:r>
+    </w:p>
+    <w:p>
+      <w:pPr>
+        <w:ind w:firstLine="0"/>
+      </w:pPr>
+      <w:r>
+        <w:rPr>
+          <w:i/>
+        </w:rPr>
+        <w:t>Note.</w:t>
+      </w:r>
+      <w:r>
+        <w:t xml:space="preserve"> Panel A shows that the sex = 0 threshold needed to match sex = 1 recall ranges from .05 to .50 (</w:t>
+      </w:r>
+      <w:r>
+        <w:rPr>
+          <w:i/>
+        </w:rPr>
+        <w:t>M</w:t>
+      </w:r>
+      <w:r>
+        <w:t xml:space="preserve"> = .336, </w:t>
+      </w:r>
+      <w:r>
+        <w:rPr>
+          <w:i/>
+        </w:rPr>
+        <w:t>SD</w:t>
+      </w:r>
+      <w:r>
+        <w:t xml:space="preserve"> = .157), almost the full usable range. Panel B shows why: each split leaves 2 to 11 disease cases in the subgroup, so one patient shifts recall by about 18 percentage points. The remedy cannot be calibrated reliably on this dataset.</w:t>
       </w:r>
     </w:p>
     <w:p>
@@ -195,6 +306,28 @@
       </w:r>
     </w:p>
     <w:p>
+      <w:pPr>
+        <w:ind w:firstLine="0"/>
+        <w:jc w:val="center"/>
+      </w:pPr>
+      <w:r>
+        <w:rPr>
+          <w:b/>
+        </w:rPr>
+        <w:t>Teamwork and Documentation</w:t>
+      </w:r>
+    </w:p>
+    <w:p>
+      <w:r>
+        <w:t>Group 8 coordinated daily through WhatsApp and carried out the analysis in a single shared Google Colab notebook, which one member synchronized to the team's GitHub repository; the repository decision log, rather than the commit history, records individual contributions. Roles were agreed on 5 October. The brief for this deliverable names five sections, but the grading rubric retains all eight criteria, and the four it does not name carry 55% of the marks. Work was therefore divided against the rubric rather than the brief: Christian Gaston took the problem and dataset recap, Real-World Application, and final assembly; Subba Taniparti, hyperparameter tuning and evaluation metrics; Harini Mamidala, the evaluation figures and conclusion, since her earlier area of data exploration has no section here; and Bellary Naveen Vishal, ethical considerations and team documentation.</w:t>
+      </w:r>
+    </w:p>
+    <w:p>
+      <w:r>
+        <w:t>The decision that mattered most was committing one fully executed notebook before anyone began writing, so that every section would cite the same numbers. A single shared source also made its weaknesses visible to the whole team at once. Within a day the team had logged two: nested cross-validation had drawn on the full dataset, including the held-out test patients, and the cost-based thresholds had been chosen using test outcomes. Drafting then exposed a third, coefficient labels that did not follow the column order of the preprocessing pipeline, which undermined an interpretive claim about maximum heart rate. With the deadline falling in the same week as an examination and a discussion assignment, rerunning the analysis was not feasible, so all three were recorded in the decision log and are reported in this paper as limitations rather than omitted. The same constraint is why drafts were due a full week before submission.</w:t>
+      </w:r>
+    </w:p>
+    <w:p>
       <w:r>
         <w:br w:type="page"/>
       </w:r>
@@ -216,7 +349,75 @@
         <w:ind w:hanging="720" w:left="720"/>
       </w:pPr>
       <w:r>
+        <w:t xml:space="preserve">Chen, I. Y., Szolovits, P., &amp; Ghassemi, M. (2019). Can AI help reduce disparities in general medical and mental health care? </w:t>
+      </w:r>
+      <w:r>
+        <w:rPr>
+          <w:i/>
+        </w:rPr>
+        <w:t>AMA Journal of Ethics, 21</w:t>
+      </w:r>
+      <w:r>
+        <w:t>(2), E167–E179. https://doi.org/10.1001/amajethics.2019.167</w:t>
+      </w:r>
+    </w:p>
+    <w:p>
+      <w:pPr>
+        <w:ind w:hanging="720" w:left="720"/>
+      </w:pPr>
+      <w:r>
+        <w:t xml:space="preserve">Lee, K. K., Ferry, A. V., Anand, A., Strachan, F. E., Chapman, A. R., Kimenai, D. M., Meex, S. J. R., Berry, C., Findlay, I., Reid, A., Cruickshank, A., Gray, A., Collinson, P. O., Apple, F. S., McAllister, D. A., Maguire, D., Fox, K. A. A., Newby, D. E., Tuck, C., . . . Mills, N. L. (2019). Sex-specific thresholds of high-sensitivity troponin in patients with suspected acute coronary syndrome. </w:t>
+      </w:r>
+      <w:r>
+        <w:rPr>
+          <w:i/>
+        </w:rPr>
+        <w:t>Journal of the American College of Cardiology, 74</w:t>
+      </w:r>
+      <w:r>
+        <w:t>(16), 2032–2043. https://doi.org/10.1016/j.jacc.2019.07.082</w:t>
+      </w:r>
+    </w:p>
+    <w:p>
+      <w:pPr>
+        <w:ind w:hanging="720" w:left="720"/>
+      </w:pPr>
+      <w:r>
+        <w:t xml:space="preserve">Mosca, L., Barrett-Connor, E., &amp; Wenger, N. K. (2011). Sex/gender differences in cardiovascular disease prevention: What a difference a decade makes. </w:t>
+      </w:r>
+      <w:r>
+        <w:rPr>
+          <w:i/>
+        </w:rPr>
+        <w:t>Circulation, 124</w:t>
+      </w:r>
+      <w:r>
+        <w:t>(19), 2145–2154. https://doi.org/10.1161/CIRCULATIONAHA.110.968792</w:t>
+      </w:r>
+    </w:p>
+    <w:p>
+      <w:pPr>
+        <w:ind w:hanging="720" w:left="720"/>
+      </w:pPr>
+      <w:r>
         <w:t>Pedregosa, F., Varoquaux, G., Gramfort, A., Michel, V., Thirion, B., Grisel, O., Blondel, M., Prettenhofer, P., Weiss, R., Dubourg, V., Vanderplas, J., Passos, A., Cournapeau, D., Brucher, M., Perrot, M., &amp; Duchesnay, É. (2011). Scikit-learn: Machine learning in Python. Journal of Machine Learning Research, 12, 2825–2830. https://jmlr.org/papers/v12/pedregosa11a.html</w:t>
+      </w:r>
+    </w:p>
+    <w:p>
+      <w:pPr>
+        <w:ind w:hanging="720" w:left="720"/>
+      </w:pPr>
+      <w:r>
+        <w:t xml:space="preserve">Rajkomar, A., Hardt, M., Howell, M. D., Corrado, G., &amp; Chin, M. H. (2018). Ensuring fairness in machine learning to advance health equity. </w:t>
+      </w:r>
+      <w:r>
+        <w:rPr>
+          <w:i/>
+        </w:rPr>
+        <w:t>Annals of Internal Medicine, 169</w:t>
+      </w:r>
+      <w:r>
+        <w:t>(12), 866–872. https://doi.org/10.7326/M18-1990</w:t>
       </w:r>
     </w:p>
     <w:p>
@@ -241,6 +442,40 @@
       </w:pPr>
       <w:r>
         <w:t>scikit-learn developers. (n.d.-c). Tuning the decision threshold for class prediction. scikit-learn. https://scikit-learn.org/stable/modules/classification_threshold.html</w:t>
+      </w:r>
+    </w:p>
+    <w:p>
+      <w:pPr>
+        <w:ind w:hanging="720" w:left="720"/>
+      </w:pPr>
+      <w:r>
+        <w:t xml:space="preserve">Shah, A. S. V., Griffiths, M., Lee, K. K., McAllister, D. A., Hunter, A. L., Ferry, A. V., Cruikshank, A., Reid, A., Stoddart, M., Strachan, F., Walker, S., Collinson, P. O., Apple, F. S., Gray, A. J., Fox, K. A. A., Newby, D. E., &amp; Mills, N. L. (2015). High sensitivity cardiac troponin and the under-diagnosis of myocardial infarction in women: Prospective cohort study. </w:t>
+      </w:r>
+      <w:r>
+        <w:rPr>
+          <w:i/>
+        </w:rPr>
+        <w:t>BMJ, 350</w:t>
+      </w:r>
+      <w:r>
+        <w:t>, Article g7873. https://doi.org/10.1136/bmj.g7873</w:t>
+      </w:r>
+    </w:p>
+    <w:p>
+      <w:pPr>
+        <w:ind w:hanging="720" w:left="720"/>
+      </w:pPr>
+      <w:r>
+        <w:t xml:space="preserve">Thygesen, K., Alpert, J. S., Jaffe, A. S., Chaitman, B. R., Bax, J. J., Morrow, D. A., &amp; White, H. D. (2018). Fourth universal definition of myocardial infarction (2018). </w:t>
+      </w:r>
+      <w:r>
+        <w:rPr>
+          <w:i/>
+        </w:rPr>
+        <w:t>Journal of the American College of Cardiology, 72</w:t>
+      </w:r>
+      <w:r>
+        <w:t>(18), 2231–2264. https://doi.org/10.1016/j.jacc.2018.08.1038</w:t>
       </w:r>
     </w:p>
     <w:sectPr>

</xml_diff>

<commit_message>
Consolidate Part 2 draft to a single file
</commit_message>
<xml_diff>
--- a/part2/report/drafts/Group8_Part2_Report_Draft.docx
+++ b/part2/report/drafts/Group8_Part2_Report_Draft.docx
@@ -57,6 +57,15 @@
       </w:pPr>
       <w:r>
         <w:t>Group Project Part 2</w:t>
+      </w:r>
+    </w:p>
+    <w:p>
+      <w:pPr>
+        <w:ind w:firstLine="0"/>
+        <w:jc w:val="center"/>
+      </w:pPr>
+      <w:r>
+        <w:t>October 16, 2026</w:t>
       </w:r>
     </w:p>
     <w:p>

</xml_diff>